<commit_message>
Eliminar y modificar mi respuesta final
Eliminar estos documentos que no eran necesarios y añadir mi pregunta final.
</commit_message>
<xml_diff>
--- a/PREGUNTA_WENDY_QUESADA.docx
+++ b/PREGUNTA_WENDY_QUESADA.docx
@@ -90,6 +90,12 @@
           <w:lang w:val="es-CR"/>
         </w:rPr>
         <w:t>Una diferencia importa</w:t>
+      </w:r>
+      <w:r>
+        <w:rPr>
+          <w:lang w:val="es-CR"/>
+        </w:rPr>
+        <w:t xml:space="preserve">nte entre estos softwares es que, en los genéricos, las organizaciones que desarrolla el Software controlan sus especificaciones. La especificación de los productos personalizados, por lo general, es desarrollada y controlada por la organización que compra el Software. </w:t>
       </w:r>
     </w:p>
     <w:sectPr>

</xml_diff>